<commit_message>
Synchronize manuscript evidence and research artifacts
</commit_message>
<xml_diff>
--- a/Sports_ERP_AI_IEEE_Conference_Paper_FINAL.docx
+++ b/Sports_ERP_AI_IEEE_Conference_Paper_FINAL.docx
@@ -4833,7 +4833,7 @@
                 <w:color w:val="111111"/>
                 <w:sz w:val="16"/>
               </w:rPr>
-              <w:t>90.0%</w:t>
+              <w:t>83.3%</w:t>
             </w:r>
           </w:p>
         </w:tc>
@@ -4883,7 +4883,7 @@
                 <w:color w:val="111111"/>
                 <w:sz w:val="16"/>
               </w:rPr>
-              <w:t>93.3%</w:t>
+              <w:t>86.7%</w:t>
             </w:r>
           </w:p>
         </w:tc>
@@ -4908,7 +4908,7 @@
                 <w:color w:val="111111"/>
                 <w:sz w:val="16"/>
               </w:rPr>
-              <w:t>100.0%</w:t>
+              <w:t>93.3%</w:t>
             </w:r>
           </w:p>
         </w:tc>
@@ -5068,7 +5068,7 @@
                 <w:color w:val="111111"/>
                 <w:sz w:val="16"/>
               </w:rPr>
-              <w:t>Mean latency</w:t>
+              <w:t>Mean execution latency</w:t>
             </w:r>
           </w:p>
         </w:tc>
@@ -5118,7 +5118,7 @@
                 <w:color w:val="111111"/>
                 <w:sz w:val="16"/>
               </w:rPr>
-              <w:t>0.10 ms</w:t>
+              <w:t>0.17 ms</w:t>
             </w:r>
           </w:p>
         </w:tc>
@@ -5168,7 +5168,7 @@
                 <w:color w:val="111111"/>
                 <w:sz w:val="16"/>
               </w:rPr>
-              <w:t>5.88 ms</w:t>
+              <w:t>7.29 ms (median 1.52 ms)</w:t>
             </w:r>
           </w:p>
         </w:tc>
@@ -5458,7 +5458,7 @@
                 <w:color w:val="111111"/>
                 <w:sz w:val="16"/>
               </w:rPr>
-              <w:t>vs. Text-to-SQL (self-reported)</w:t>
+              <w:t>vs. Text-to-SQL (paired t-test)</w:t>
             </w:r>
           </w:p>
         </w:tc>
@@ -5558,7 +5558,137 @@
                 <w:color w:val="111111"/>
                 <w:sz w:val="16"/>
               </w:rPr>
-              <w:t>t=2.13, p&lt;0.05, d=0.55</w:t>
+              <w:t>t(29)=1.285, p=0.209, dz=0.235</w:t>
+            </w:r>
+          </w:p>
+        </w:tc>
+      </w:tr>
+      <w:tr>
+        <w:trPr>
+          <w:cantSplit/>
+        </w:trPr>
+        <w:tc>
+          <w:tcPr>
+            <w:tcW w:type="dxa" w:w="2592"/>
+            <w:shd w:fill="FFFFFF"/>
+            <w:tcMar>
+              <w:top w:w="45" w:type="dxa"/>
+              <w:bottom w:w="45" w:type="dxa"/>
+              <w:left w:w="80" w:type="dxa"/>
+              <w:right w:w="80" w:type="dxa"/>
+            </w:tcMar>
+          </w:tcPr>
+          <w:p>
+            <w:pPr>
+              <w:jc w:val="left"/>
+            </w:pPr>
+            <w:r>
+              <w:rPr>
+                <w:rFonts w:ascii="Times New Roman" w:hAnsi="Times New Roman"/>
+                <w:color w:val="111111"/>
+                <w:sz w:val="16"/>
+              </w:rPr>
+              <w:t>vs. Text-to-SQL (Welch test)</w:t>
+            </w:r>
+          </w:p>
+        </w:tc>
+        <w:tc>
+          <w:tcPr>
+            <w:tcW w:type="dxa" w:w="1584"/>
+            <w:shd w:fill="FFFFFF"/>
+            <w:tcMar>
+              <w:top w:w="45" w:type="dxa"/>
+              <w:bottom w:w="45" w:type="dxa"/>
+              <w:left w:w="80" w:type="dxa"/>
+              <w:right w:w="80" w:type="dxa"/>
+            </w:tcMar>
+          </w:tcPr>
+          <w:p>
+            <w:pPr>
+              <w:jc w:val="left"/>
+            </w:pPr>
+            <w:r>
+              <w:rPr>
+                <w:rFonts w:ascii="Times New Roman" w:hAnsi="Times New Roman"/>
+                <w:color w:val="111111"/>
+                <w:sz w:val="16"/>
+              </w:rPr>
+              <w:t>–</w:t>
+            </w:r>
+          </w:p>
+        </w:tc>
+        <w:tc>
+          <w:tcPr>
+            <w:tcW w:type="dxa" w:w="1872"/>
+            <w:shd w:fill="FFFFFF"/>
+            <w:tcMar>
+              <w:top w:w="45" w:type="dxa"/>
+              <w:bottom w:w="45" w:type="dxa"/>
+              <w:left w:w="80" w:type="dxa"/>
+              <w:right w:w="80" w:type="dxa"/>
+            </w:tcMar>
+          </w:tcPr>
+          <w:p>
+            <w:pPr>
+              <w:jc w:val="left"/>
+            </w:pPr>
+            <w:r>
+              <w:rPr>
+                <w:rFonts w:ascii="Times New Roman" w:hAnsi="Times New Roman"/>
+                <w:color w:val="111111"/>
+                <w:sz w:val="16"/>
+              </w:rPr>
+              <w:t>–</w:t>
+            </w:r>
+          </w:p>
+        </w:tc>
+        <w:tc>
+          <w:tcPr>
+            <w:tcW w:type="dxa" w:w="1728"/>
+            <w:shd w:fill="FFFFFF"/>
+            <w:tcMar>
+              <w:top w:w="45" w:type="dxa"/>
+              <w:bottom w:w="45" w:type="dxa"/>
+              <w:left w:w="80" w:type="dxa"/>
+              <w:right w:w="80" w:type="dxa"/>
+            </w:tcMar>
+          </w:tcPr>
+          <w:p>
+            <w:pPr>
+              <w:jc w:val="left"/>
+            </w:pPr>
+            <w:r>
+              <w:rPr>
+                <w:rFonts w:ascii="Times New Roman" w:hAnsi="Times New Roman"/>
+                <w:color w:val="111111"/>
+                <w:sz w:val="16"/>
+              </w:rPr>
+              <w:t>–</w:t>
+            </w:r>
+          </w:p>
+        </w:tc>
+        <w:tc>
+          <w:tcPr>
+            <w:tcW w:type="dxa" w:w="1800"/>
+            <w:shd w:fill="FFFFFF"/>
+            <w:tcMar>
+              <w:top w:w="45" w:type="dxa"/>
+              <w:bottom w:w="45" w:type="dxa"/>
+              <w:left w:w="80" w:type="dxa"/>
+              <w:right w:w="80" w:type="dxa"/>
+            </w:tcMar>
+          </w:tcPr>
+          <w:p>
+            <w:pPr>
+              <w:jc w:val="left"/>
+            </w:pPr>
+            <w:r>
+              <w:rPr>
+                <w:rFonts w:ascii="Times New Roman" w:hAnsi="Times New Roman"/>
+                <w:color w:val="111111"/>
+                <w:sz w:val="16"/>
+              </w:rPr>
+              <w:t>t(29)=1.283, p=0.210, d=0.331</w:t>
             </w:r>
           </w:p>
         </w:tc>
@@ -5590,7 +5720,7 @@
           <w:rFonts w:ascii="Times New Roman" w:hAnsi="Times New Roman"/>
           <w:sz w:val="20"/>
         </w:rPr>
-        <w:t>However, when compared against all four baselines (three previously discussed + one newly introduced in this section), the proposed approach demonstrated a higher success rate in completing tasks, as well as lower frequency of constraint violation, at the expense of increased latency (when compared to read-only Text-to-SQL and monolithic function calling approaches, the latency was about 5.88 ms against 0.10-1.20 ms); all latencies were kept well below the level of human-perceivable interaction threshold. Also, it is noticeable that a lower token cost (420 versus 1,250 tokens per query), which was reported by the proposed approach, can be attributed to a more efficient intent routing mechanism, which exposes fewer tools to the model per turn; however, once again, this comparison was not independently verified in this manuscript.</w:t>
+        <w:t>Across the 30 matched enterprise scenarios, the proposed hybrid architecture exhibited higher mean execution latency (7.29 ms, median 1.52 ms, SD 30.41 ms) than simpler baselines (0.17 ms for read-only Text-to-SQL and 1.20 ms for monolithic function calling). This added computational time reflects the execution of two-stage intent routing, dynamic uncertainty evaluation, eight-invariant constraint validation, and linear SHA-256 hash chaining. All latencies remain well below the 200 ms interactive threshold for conversational systems. The scenario-matched paired t-test between the proposed system and the Text-to-SQL baseline did not indicate a statistically significant latency difference (t(29) = 1.285, p = 0.209, Cohen's dz = 0.235); an independent Welch sensitivity analysis similarly yielded t(29) = 1.283, p = 0.210, Cohen's d = 0.331. In terms of efficiency, the proposed approach achieved a reduced token footprint (420 versus 1,250 tokens per query) by exposing fewer domain-specific tools per turn via specialized agent delegation; however, once again, this comparison was not independently verified in this manuscript.</w:t>
       </w:r>
     </w:p>
     <w:p>
@@ -7077,7 +7207,7 @@
           <w:rFonts w:ascii="Times New Roman" w:hAnsi="Times New Roman"/>
           <w:sz w:val="17"/>
         </w:rPr>
-        <w:t>[13] B. Schneier and J. Kelsey, “Cryptographic Support for Secure Logs on Untrusted Machines,” ACM Transactions on Information and System Security (TISSEC), vol. 2, no. 3, pp. 224–244, 1999.</w:t>
+        <w:t>[13] B. Schneier and J. Kelsey, “Cryptographic Support for Secure Logs on Untrusted Machines,” in Proc. 7th USENIX Security Symposium, 1998, pp. 53–62.</w:t>
       </w:r>
     </w:p>
     <w:p>

</xml_diff>

<commit_message>
Finalize publication figures and manuscript
</commit_message>
<xml_diff>
--- a/Sports_ERP_AI_IEEE_Conference_Paper_FINAL.docx
+++ b/Sports_ERP_AI_IEEE_Conference_Paper_FINAL.docx
@@ -473,7 +473,7 @@
       <w:r>
         <w:drawing>
           <wp:inline xmlns:a="http://schemas.openxmlformats.org/drawingml/2006/main" xmlns:pic="http://schemas.openxmlformats.org/drawingml/2006/picture">
-            <wp:extent cx="6080760" cy="4292301"/>
+            <wp:extent cx="6080760" cy="4547795"/>
             <wp:docPr id="1" name="Picture 1"/>
             <wp:cNvGraphicFramePr>
               <a:graphicFrameLocks noChangeAspect="1"/>
@@ -494,7 +494,7 @@
                   <pic:spPr>
                     <a:xfrm>
                       <a:off x="0" y="0"/>
-                      <a:ext cx="6080760" cy="4292301"/>
+                      <a:ext cx="6080760" cy="4547795"/>
                     </a:xfrm>
                     <a:prstGeom prst="rect"/>
                   </pic:spPr>
@@ -1376,7 +1376,7 @@
       <w:r>
         <w:drawing>
           <wp:inline xmlns:a="http://schemas.openxmlformats.org/drawingml/2006/main" xmlns:pic="http://schemas.openxmlformats.org/drawingml/2006/picture">
-            <wp:extent cx="6080760" cy="4122644"/>
+            <wp:extent cx="6080760" cy="4446385"/>
             <wp:docPr id="2" name="Picture 2"/>
             <wp:cNvGraphicFramePr>
               <a:graphicFrameLocks noChangeAspect="1"/>
@@ -1397,7 +1397,7 @@
                   <pic:spPr>
                     <a:xfrm>
                       <a:off x="0" y="0"/>
-                      <a:ext cx="6080760" cy="4122644"/>
+                      <a:ext cx="6080760" cy="4446385"/>
                     </a:xfrm>
                     <a:prstGeom prst="rect"/>
                   </pic:spPr>
@@ -2587,7 +2587,7 @@
       <w:r>
         <w:drawing>
           <wp:inline xmlns:a="http://schemas.openxmlformats.org/drawingml/2006/main" xmlns:pic="http://schemas.openxmlformats.org/drawingml/2006/picture">
-            <wp:extent cx="6080760" cy="4171597"/>
+            <wp:extent cx="6080760" cy="4704616"/>
             <wp:docPr id="3" name="Picture 3"/>
             <wp:cNvGraphicFramePr>
               <a:graphicFrameLocks noChangeAspect="1"/>
@@ -2608,7 +2608,7 @@
                   <pic:spPr>
                     <a:xfrm>
                       <a:off x="0" y="0"/>
-                      <a:ext cx="6080760" cy="4171597"/>
+                      <a:ext cx="6080760" cy="4704616"/>
                     </a:xfrm>
                     <a:prstGeom prst="rect"/>
                   </pic:spPr>
@@ -3236,7 +3236,7 @@
       <w:r>
         <w:drawing>
           <wp:inline xmlns:a="http://schemas.openxmlformats.org/drawingml/2006/main" xmlns:pic="http://schemas.openxmlformats.org/drawingml/2006/picture">
-            <wp:extent cx="6080760" cy="4407156"/>
+            <wp:extent cx="6080760" cy="4738946"/>
             <wp:docPr id="4" name="Picture 4"/>
             <wp:cNvGraphicFramePr>
               <a:graphicFrameLocks noChangeAspect="1"/>
@@ -3257,7 +3257,7 @@
                   <pic:spPr>
                     <a:xfrm>
                       <a:off x="0" y="0"/>
-                      <a:ext cx="6080760" cy="4407156"/>
+                      <a:ext cx="6080760" cy="4738946"/>
                     </a:xfrm>
                     <a:prstGeom prst="rect"/>
                   </pic:spPr>
@@ -3349,7 +3349,7 @@
       <w:r>
         <w:drawing>
           <wp:inline xmlns:a="http://schemas.openxmlformats.org/drawingml/2006/main" xmlns:pic="http://schemas.openxmlformats.org/drawingml/2006/picture">
-            <wp:extent cx="6080760" cy="4305993"/>
+            <wp:extent cx="6080760" cy="4699169"/>
             <wp:docPr id="5" name="Picture 5"/>
             <wp:cNvGraphicFramePr>
               <a:graphicFrameLocks noChangeAspect="1"/>
@@ -3370,7 +3370,7 @@
                   <pic:spPr>
                     <a:xfrm>
                       <a:off x="0" y="0"/>
-                      <a:ext cx="6080760" cy="4305993"/>
+                      <a:ext cx="6080760" cy="4699169"/>
                     </a:xfrm>
                     <a:prstGeom prst="rect"/>
                   </pic:spPr>
@@ -3559,7 +3559,7 @@
       <w:r>
         <w:drawing>
           <wp:inline xmlns:a="http://schemas.openxmlformats.org/drawingml/2006/main" xmlns:pic="http://schemas.openxmlformats.org/drawingml/2006/picture">
-            <wp:extent cx="6080760" cy="4128222"/>
+            <wp:extent cx="6080760" cy="4547795"/>
             <wp:docPr id="6" name="Picture 6"/>
             <wp:cNvGraphicFramePr>
               <a:graphicFrameLocks noChangeAspect="1"/>
@@ -3580,7 +3580,7 @@
                   <pic:spPr>
                     <a:xfrm>
                       <a:off x="0" y="0"/>
-                      <a:ext cx="6080760" cy="4128222"/>
+                      <a:ext cx="6080760" cy="4547795"/>
                     </a:xfrm>
                     <a:prstGeom prst="rect"/>
                   </pic:spPr>

</xml_diff>

<commit_message>
Finalize academic figures and manuscript
</commit_message>
<xml_diff>
--- a/Sports_ERP_AI_IEEE_Conference_Paper_FINAL.docx
+++ b/Sports_ERP_AI_IEEE_Conference_Paper_FINAL.docx
@@ -473,7 +473,7 @@
       <w:r>
         <w:drawing>
           <wp:inline xmlns:a="http://schemas.openxmlformats.org/drawingml/2006/main" xmlns:pic="http://schemas.openxmlformats.org/drawingml/2006/picture">
-            <wp:extent cx="6080760" cy="4547795"/>
+            <wp:extent cx="6080760" cy="4480560"/>
             <wp:docPr id="1" name="Picture 1"/>
             <wp:cNvGraphicFramePr>
               <a:graphicFrameLocks noChangeAspect="1"/>
@@ -494,7 +494,7 @@
                   <pic:spPr>
                     <a:xfrm>
                       <a:off x="0" y="0"/>
-                      <a:ext cx="6080760" cy="4547795"/>
+                      <a:ext cx="6080760" cy="4480560"/>
                     </a:xfrm>
                     <a:prstGeom prst="rect"/>
                   </pic:spPr>
@@ -1376,7 +1376,7 @@
       <w:r>
         <w:drawing>
           <wp:inline xmlns:a="http://schemas.openxmlformats.org/drawingml/2006/main" xmlns:pic="http://schemas.openxmlformats.org/drawingml/2006/picture">
-            <wp:extent cx="6080760" cy="4446385"/>
+            <wp:extent cx="6080760" cy="4445597"/>
             <wp:docPr id="2" name="Picture 2"/>
             <wp:cNvGraphicFramePr>
               <a:graphicFrameLocks noChangeAspect="1"/>
@@ -1397,7 +1397,7 @@
                   <pic:spPr>
                     <a:xfrm>
                       <a:off x="0" y="0"/>
-                      <a:ext cx="6080760" cy="4446385"/>
+                      <a:ext cx="6080760" cy="4445597"/>
                     </a:xfrm>
                     <a:prstGeom prst="rect"/>
                   </pic:spPr>
@@ -1427,6 +1427,103 @@
           <w:sz w:val="17"/>
         </w:rPr>
         <w:t>Agentic request-processing pipeline: uncertainty harness, intent routing, and the PERR (Planner–Executor–Reflector–Responder) execution graph with bounded replanning.</w:t>
+      </w:r>
+    </w:p>
+    <w:p>
+      <w:pPr>
+        <w:sectPr>
+          <w:type w:val="continuous"/>
+          <w:pgSz w:w="12240" w:h="15840"/>
+          <w:pgMar w:top="1080" w:right="900" w:bottom="1440" w:left="900" w:header="720" w:footer="720" w:gutter="0"/>
+          <w:docGrid w:linePitch="360"/>
+          <w:cols w:num="1" w:space="360"/>
+        </w:sectPr>
+      </w:pPr>
+    </w:p>
+    <w:p>
+      <w:pPr>
+        <w:spacing w:after="60" w:line="252" w:lineRule="auto"/>
+        <w:jc w:val="both"/>
+      </w:pPr>
+      <w:r>
+        <w:rPr>
+          <w:rFonts w:ascii="Times New Roman" w:hAnsi="Times New Roman"/>
+          <w:sz w:val="20"/>
+        </w:rPr>
+        <w:t>Fig. 3 illustrates the end-to-end agentic decision pipeline: from intent understanding and specialist delegation, through typed tool binding, RBAC authorization, and controlled tool execution, to rubric reflection and state commitment.</w:t>
+      </w:r>
+    </w:p>
+    <w:p>
+      <w:pPr>
+        <w:sectPr>
+          <w:type w:val="continuous"/>
+          <w:pgSz w:w="12240" w:h="15840"/>
+          <w:pgMar w:top="1080" w:right="900" w:bottom="1440" w:left="900" w:header="720" w:footer="720" w:gutter="0"/>
+          <w:docGrid w:linePitch="360"/>
+          <w:cols w:num="2" w:space="360"/>
+        </w:sectPr>
+      </w:pPr>
+    </w:p>
+    <w:p>
+      <w:pPr>
+        <w:keepNext/>
+        <w:spacing w:before="120" w:after="40"/>
+        <w:jc w:val="center"/>
+      </w:pPr>
+      <w:r>
+        <w:drawing>
+          <wp:inline xmlns:a="http://schemas.openxmlformats.org/drawingml/2006/main" xmlns:pic="http://schemas.openxmlformats.org/drawingml/2006/picture">
+            <wp:extent cx="6080760" cy="4747260"/>
+            <wp:docPr id="3" name="Picture 3"/>
+            <wp:cNvGraphicFramePr>
+              <a:graphicFrameLocks noChangeAspect="1"/>
+            </wp:cNvGraphicFramePr>
+            <a:graphic>
+              <a:graphicData uri="http://schemas.openxmlformats.org/drawingml/2006/picture">
+                <pic:pic>
+                  <pic:nvPicPr>
+                    <pic:cNvPr id="0" name="agentic_decision_pipeline.png"/>
+                    <pic:cNvPicPr/>
+                  </pic:nvPicPr>
+                  <pic:blipFill>
+                    <a:blip r:embed="rId11"/>
+                    <a:stretch>
+                      <a:fillRect/>
+                    </a:stretch>
+                  </pic:blipFill>
+                  <pic:spPr>
+                    <a:xfrm>
+                      <a:off x="0" y="0"/>
+                      <a:ext cx="6080760" cy="4747260"/>
+                    </a:xfrm>
+                    <a:prstGeom prst="rect"/>
+                  </pic:spPr>
+                </pic:pic>
+              </a:graphicData>
+            </a:graphic>
+          </wp:inline>
+        </w:drawing>
+      </w:r>
+    </w:p>
+    <w:p>
+      <w:pPr>
+        <w:spacing w:before="40" w:after="120"/>
+        <w:jc w:val="center"/>
+      </w:pPr>
+      <w:r>
+        <w:rPr>
+          <w:rFonts w:ascii="Times New Roman" w:hAnsi="Times New Roman"/>
+          <w:b/>
+          <w:sz w:val="17"/>
+        </w:rPr>
+        <w:t xml:space="preserve">Fig. 3. </w:t>
+      </w:r>
+      <w:r>
+        <w:rPr>
+          <w:rFonts w:ascii="Times New Roman" w:hAnsi="Times New Roman"/>
+          <w:sz w:val="17"/>
+        </w:rPr>
+        <w:t>Agentic decision pipeline for intent understanding, typed tool binding, authorization, controlled execution, and bounded PERR reflection.</w:t>
       </w:r>
     </w:p>
     <w:p>
@@ -2564,7 +2661,7 @@
           <w:rFonts w:ascii="Times New Roman" w:hAnsi="Times New Roman"/>
           <w:sz w:val="20"/>
         </w:rPr>
-        <w:t>In case of conflict between slots (C5), the system sorts the available slots according to the circular distance between them in terms of the seven standard intervals in a campus, and returns the list as well as the conflict core as the contrastive explanation of why not R, and what else, as shown in Fig. 3.</w:t>
+        <w:t>In case of conflict between slots (C5), the system sorts the available slots according to the circular distance between them in terms of the seven standard intervals in a campus, and returns the list as well as the conflict core as the contrastive explanation of why not R, and what else. Fig. 4 illustrates the propositional invariant governance architecture across the eight domain constraints (C1–C8), partitioned into identity, temporal, facility, and quota categories, showing both the satisfiable commitment path and the unsatisfiable MUS/MCS conflict extraction path.</w:t>
       </w:r>
     </w:p>
     <w:p>
@@ -2587,8 +2684,8 @@
       <w:r>
         <w:drawing>
           <wp:inline xmlns:a="http://schemas.openxmlformats.org/drawingml/2006/main" xmlns:pic="http://schemas.openxmlformats.org/drawingml/2006/picture">
-            <wp:extent cx="6080760" cy="4704616"/>
-            <wp:docPr id="3" name="Picture 3"/>
+            <wp:extent cx="6080760" cy="4853940"/>
+            <wp:docPr id="4" name="Picture 4"/>
             <wp:cNvGraphicFramePr>
               <a:graphicFrameLocks noChangeAspect="1"/>
             </wp:cNvGraphicFramePr>
@@ -2596,11 +2693,11 @@
               <a:graphicData uri="http://schemas.openxmlformats.org/drawingml/2006/picture">
                 <pic:pic>
                   <pic:nvPicPr>
-                    <pic:cNvPr id="0" name="constraint_resolution.png"/>
+                    <pic:cNvPr id="0" name="invariant_governance.png"/>
                     <pic:cNvPicPr/>
                   </pic:nvPicPr>
                   <pic:blipFill>
-                    <a:blip r:embed="rId11"/>
+                    <a:blip r:embed="rId12"/>
                     <a:stretch>
                       <a:fillRect/>
                     </a:stretch>
@@ -2608,7 +2705,7 @@
                   <pic:spPr>
                     <a:xfrm>
                       <a:off x="0" y="0"/>
-                      <a:ext cx="6080760" cy="4704616"/>
+                      <a:ext cx="6080760" cy="4853940"/>
                     </a:xfrm>
                     <a:prstGeom prst="rect"/>
                   </pic:spPr>
@@ -2630,14 +2727,14 @@
           <w:b/>
           <w:sz w:val="17"/>
         </w:rPr>
-        <w:t xml:space="preserve">Fig. 3. </w:t>
+        <w:t xml:space="preserve">Fig. 4. </w:t>
       </w:r>
       <w:r>
         <w:rPr>
           <w:rFonts w:ascii="Times New Roman" w:hAnsi="Times New Roman"/>
           <w:sz w:val="17"/>
         </w:rPr>
-        <w:t>Parallel invariant evaluation followed by MUS-based conflict-core extraction (unsatisfiable path) or direct commitment (satisfiable path).</w:t>
+        <w:t>Propositional invariant governance for C1–C8 constraints across four groups (Identity &amp; Access, Temporal Constraints, Facility &amp; Compatibility, Quota &amp; Concurrency) with satisfiable and unsatisfiable outcomes.</w:t>
       </w:r>
     </w:p>
     <w:p>
@@ -3213,92 +3310,8 @@
           <w:rFonts w:ascii="Times New Roman" w:hAnsi="Times New Roman"/>
           <w:sz w:val="20"/>
         </w:rPr>
-        <w:t>Fig. 4 depicts the multi-turn lifecycle of a standard booking request. After pre-validation based on time and scheduling (rejection of past dates and off-hour slots), an available request arms a pending confirmation stage and requests an explicit confirmation from the user. In the next turn, a positive confirmation ("Yes") initiates a transaction commit, which is protected by a unique idempotency key; a negative response ("No") causes the rejection of the pending action without modifying the database; and any unrelated input (such as "Who am I?") is responded to using session context while deactivating the pending booking, thus avoiding potential misunderstanding of the new input as a confirmation. In case of cancellation with multiple candidates, the agent restricts the list of candidates to the user’s own bookings and allows both an ordinal input ("option 2") or an explicit booking identifier.</w:t>
+        <w:t>The multi-turn lifecycle of a standard booking request operates as follows: after pre-validation based on time and scheduling (rejection of past dates and off-hour slots), an available request arms a pending confirmation stage and requests an explicit confirmation from the user. In the next turn, a positive confirmation ("Yes") initiates a transaction commit, which is protected by a unique idempotency key; a negative response ("No") causes the rejection of the pending action without modifying the database; and any unrelated input (such as "Who am I?") is responded to using session context while deactivating the pending booking, thus avoiding potential misunderstanding of the new input as a confirmation. In case of cancellation with multiple candidates, the agent restricts the list of candidates to the user’s own bookings and allows both an ordinal input ("option 2") or an explicit booking identifier.</w:t>
       </w:r>
-    </w:p>
-    <w:p>
-      <w:pPr>
-        <w:sectPr>
-          <w:type w:val="continuous"/>
-          <w:pgSz w:w="12240" w:h="15840"/>
-          <w:pgMar w:top="1080" w:right="900" w:bottom="1440" w:left="900" w:header="720" w:footer="720" w:gutter="0"/>
-          <w:docGrid w:linePitch="360"/>
-          <w:cols w:num="2" w:space="360"/>
-        </w:sectPr>
-      </w:pPr>
-    </w:p>
-    <w:p>
-      <w:pPr>
-        <w:keepNext/>
-        <w:spacing w:before="120" w:after="40"/>
-        <w:jc w:val="center"/>
-      </w:pPr>
-      <w:r>
-        <w:drawing>
-          <wp:inline xmlns:a="http://schemas.openxmlformats.org/drawingml/2006/main" xmlns:pic="http://schemas.openxmlformats.org/drawingml/2006/picture">
-            <wp:extent cx="6080760" cy="4738946"/>
-            <wp:docPr id="4" name="Picture 4"/>
-            <wp:cNvGraphicFramePr>
-              <a:graphicFrameLocks noChangeAspect="1"/>
-            </wp:cNvGraphicFramePr>
-            <a:graphic>
-              <a:graphicData uri="http://schemas.openxmlformats.org/drawingml/2006/picture">
-                <pic:pic>
-                  <pic:nvPicPr>
-                    <pic:cNvPr id="0" name="booking_workflow.png"/>
-                    <pic:cNvPicPr/>
-                  </pic:nvPicPr>
-                  <pic:blipFill>
-                    <a:blip r:embed="rId12"/>
-                    <a:stretch>
-                      <a:fillRect/>
-                    </a:stretch>
-                  </pic:blipFill>
-                  <pic:spPr>
-                    <a:xfrm>
-                      <a:off x="0" y="0"/>
-                      <a:ext cx="6080760" cy="4738946"/>
-                    </a:xfrm>
-                    <a:prstGeom prst="rect"/>
-                  </pic:spPr>
-                </pic:pic>
-              </a:graphicData>
-            </a:graphic>
-          </wp:inline>
-        </w:drawing>
-      </w:r>
-    </w:p>
-    <w:p>
-      <w:pPr>
-        <w:spacing w:before="40" w:after="120"/>
-        <w:jc w:val="center"/>
-      </w:pPr>
-      <w:r>
-        <w:rPr>
-          <w:rFonts w:ascii="Times New Roman" w:hAnsi="Times New Roman"/>
-          <w:b/>
-          <w:sz w:val="17"/>
-        </w:rPr>
-        <w:t xml:space="preserve">Fig. 4. </w:t>
-      </w:r>
-      <w:r>
-        <w:rPr>
-          <w:rFonts w:ascii="Times New Roman" w:hAnsi="Times New Roman"/>
-          <w:sz w:val="17"/>
-        </w:rPr>
-        <w:t>Conversational booking lifecycle: pre-validation, availability check, two-step confirmation, and provenance logging.</w:t>
-      </w:r>
-    </w:p>
-    <w:p>
-      <w:pPr>
-        <w:sectPr>
-          <w:type w:val="continuous"/>
-          <w:pgSz w:w="12240" w:h="15840"/>
-          <w:pgMar w:top="1080" w:right="900" w:bottom="1440" w:left="900" w:header="720" w:footer="720" w:gutter="0"/>
-          <w:docGrid w:linePitch="360"/>
-          <w:cols w:num="1" w:space="360"/>
-        </w:sectPr>
-      </w:pPr>
     </w:p>
     <w:p>
       <w:pPr>
@@ -3349,7 +3362,7 @@
       <w:r>
         <w:drawing>
           <wp:inline xmlns:a="http://schemas.openxmlformats.org/drawingml/2006/main" xmlns:pic="http://schemas.openxmlformats.org/drawingml/2006/picture">
-            <wp:extent cx="6080760" cy="4699169"/>
+            <wp:extent cx="6080760" cy="4445597"/>
             <wp:docPr id="5" name="Picture 5"/>
             <wp:cNvGraphicFramePr>
               <a:graphicFrameLocks noChangeAspect="1"/>
@@ -3370,7 +3383,7 @@
                   <pic:spPr>
                     <a:xfrm>
                       <a:off x="0" y="0"/>
-                      <a:ext cx="6080760" cy="4699169"/>
+                      <a:ext cx="6080760" cy="4445597"/>
                     </a:xfrm>
                     <a:prstGeom prst="rect"/>
                   </pic:spPr>
@@ -3536,7 +3549,7 @@
           <w:rFonts w:ascii="Times New Roman" w:hAnsi="Times New Roman"/>
           <w:sz w:val="20"/>
         </w:rPr>
-        <w:t>The design is that of a linear SHA-256 hash-chained log, and not a keyed HMAC construction nor a Merkle tree (since it doesn’t branch into pairs of hashes), hence this description to prevent any overstatement about the cryptographic construct used. A verify endpoint (GET /audit/verify/{id}) re-computes the chain from a prior log entry up to the target one; any tampering (bit-level change) to a log payload, to an inserted log entry or to a deleted log entry will break the re-computed chain after the tampered point. In the tamper-simulations included in the automated test suite (Section VI), all tampered chains have been detected; just as with the SQL sandbox, this refers to the particular tamper scenarios tried, not to a proof against all attacks.</w:t>
+        <w:t>The design strictly implements an append-only linear SHA-256 hash-chained log (Π_t = SHA256(P_t ∥ Π_{t−1}) with genesis token Π_0 = 0⁶⁴). User password authentication uses PBKDF2-HMAC-SHA256 (100,000 iterations), while provenance uses a separate linear SHA-256 hash chain. A verify endpoint (GET /audit/verify/{id}) re-computes the chain from a prior log entry up to the target one; any tampering (bit-level change) to a log payload, to an inserted log entry or to a deleted log entry will break the re-computed chain after the tampered point. In the tamper-simulations included in the automated test suite (Section VI), all tampered chains have been detected; just as with the SQL sandbox, this refers to the particular tamper scenarios tried, not to a proof against all attacks.</w:t>
       </w:r>
     </w:p>
     <w:p>
@@ -3559,7 +3572,7 @@
       <w:r>
         <w:drawing>
           <wp:inline xmlns:a="http://schemas.openxmlformats.org/drawingml/2006/main" xmlns:pic="http://schemas.openxmlformats.org/drawingml/2006/picture">
-            <wp:extent cx="6080760" cy="4547795"/>
+            <wp:extent cx="6080760" cy="4445597"/>
             <wp:docPr id="6" name="Picture 6"/>
             <wp:cNvGraphicFramePr>
               <a:graphicFrameLocks noChangeAspect="1"/>
@@ -3580,7 +3593,7 @@
                   <pic:spPr>
                     <a:xfrm>
                       <a:off x="0" y="0"/>
-                      <a:ext cx="6080760" cy="4547795"/>
+                      <a:ext cx="6080760" cy="4445597"/>
                     </a:xfrm>
                     <a:prstGeom prst="rect"/>
                   </pic:spPr>
@@ -3609,7 +3622,7 @@
           <w:rFonts w:ascii="Times New Roman" w:hAnsi="Times New Roman"/>
           <w:sz w:val="17"/>
         </w:rPr>
-        <w:t>SHA-256 hash-chained provenance ledger: payload serialization, chained digest computation, and online tamper-detection verification.</w:t>
+        <w:t>Append-only linear SHA-256 hash-chained provenance ledger: payload serialization, chained digest computation, and online tamper-detection verification.</w:t>
       </w:r>
     </w:p>
     <w:p>

</xml_diff>